<commit_message>
fix: corrige inconsistencia numerica (5.585->286), robustece SINAN/CAT, renomeia para ensaio teorico, sinaliza descritivo vs inferencial, atualiza periodos 2015-2025
</commit_message>
<xml_diff>
--- a/documentos/ensaio.docx
+++ b/documentos/ensaio.docx
@@ -9,12 +9,7 @@
         <w:jc w:val="center"/>
       </w:pPr>
       <w:r>
-        <w:rPr>
-          <w:b/>
-          <w:i w:val="0"/>
-          <w:sz w:val="28"/>
-        </w:rPr>
-        <w:t>Panorama da saúde do trabalhador em Campos dos Goytacazes (RJ)</w:t>
+        <w:t>Saúde do Trabalhador em Campos dos Goytacazes (RJ): ensaio teórico apoiado em análise multifonte, 2015–2025</w:t>
       </w:r>
     </w:p>
     <w:p>
@@ -132,12 +127,7 @@
         <w:jc w:val="both"/>
       </w:pPr>
       <w:r>
-        <w:rPr>
-          <w:b w:val="0"/>
-          <w:i w:val="0"/>
-          <w:sz w:val="24"/>
-        </w:rPr>
-        <w:t>Este ensaio analítico descreve o perfil e as taxas de notificação de acidentes de trabalho entre profissionais da saúde com vínculo celetista em Campos dos Goytacazes, de 2015 a 2025, contextualizando os achados à luz da literatura sobre sistemas de informação em saúde do trabalhador. Não se pretende testar hipóteses causais, mas identificar padrões que contribuam para a discussão sobre vigilância e subnotificação.</w:t>
+        <w:t>Este ensaio teórico, apoiado em análise multifonte de bases secundárias, descreve o perfil e as taxas de notificação de acidentes de trabalho entre profissionais da saúde com vínculo celetista em Campos dos Goytacazes, de 2015 a 2025, contextualizando os achados à luz da literatura sobre sistemas de informação em saúde do trabalhador. Não se pretende testar hipóteses causais, mas identificar padrões que contribuam para a discussão sobre vigilância e subnotificação.</w:t>
       </w:r>
     </w:p>
     <w:p>
@@ -241,7 +231,7 @@
           <w:i w:val="0"/>
           <w:sz w:val="20"/>
         </w:rPr>
-        <w:t>Tabela 1.</w:t>
+        <w:t>Tabela 1. CATs das profissões celetistas da saúde, Campos dos Goytacazes (RJ), 2015–2025.</w:t>
       </w:r>
       <w:r>
         <w:rPr>
@@ -249,7 +239,6 @@
           <w:i w:val="0"/>
           <w:sz w:val="20"/>
         </w:rPr>
-        <w:t xml:space="preserve"> CATs das profissões celetistas da saúde, Campos dos Goytacazes (RJ), 2018-2025 (n = 1.144).</w:t>
       </w:r>
     </w:p>
     <w:tbl>
@@ -1097,7 +1086,7 @@
           <w:i w:val="0"/>
           <w:sz w:val="16"/>
         </w:rPr>
-        <w:t>Fonte: CAT/INSS. IC 95% binomial exato. Cobertura: jul/2018-out/2025, parcial em 2018, 2022, 2024-2025.</w:t>
+        <w:t>Fonte: CAT/INSS. IC 95% binomial exato. Cobertura: 2015–2025, parcial em 2015-2018 (semestral), 2022 (carga irregular) e 2024-2025 (até outubro).</w:t>
       </w:r>
     </w:p>
     <w:p>
@@ -1112,7 +1101,7 @@
           <w:i w:val="0"/>
           <w:sz w:val="20"/>
         </w:rPr>
-        <w:t>Tabela 2.</w:t>
+        <w:t>Tabela 2. Taxa de notificação por 1.000 vínculos RAIS celetistas, profissões da saúde, Campos (RJ), 2015–2025.</w:t>
       </w:r>
       <w:r>
         <w:rPr>
@@ -1120,7 +1109,6 @@
           <w:i w:val="0"/>
           <w:sz w:val="20"/>
         </w:rPr>
-        <w:t xml:space="preserve"> Taxa de notificação por 1.000 vínculos RAIS celetistas, profissões da saúde, Campos (RJ), 2018-2025.</w:t>
       </w:r>
     </w:p>
     <w:tbl>
@@ -1897,7 +1885,7 @@
           <w:i w:val="0"/>
           <w:sz w:val="20"/>
         </w:rPr>
-        <w:t>Tabela 3.</w:t>
+        <w:t>Tabela 3. SINAN, agravos relacionados ao trabalho, Campos (RJ), 2015–2025.</w:t>
       </w:r>
       <w:r>
         <w:rPr>
@@ -1905,7 +1893,6 @@
           <w:i w:val="0"/>
           <w:sz w:val="20"/>
         </w:rPr>
-        <w:t xml:space="preserve"> SINAN, agravos relacionados ao trabalho, Campos (RJ), 2018-2025.</w:t>
       </w:r>
     </w:p>
     <w:tbl>
@@ -2309,7 +2296,7 @@
           <w:i w:val="0"/>
           <w:sz w:val="16"/>
         </w:rPr>
-        <w:t>Fonte: SINAN/DATASUS (FINAIS 2018-2022 + PRELIM 2023-2025). Filtro: SIT_TRAB=01 (acidentes), TRAB_DOE=1 (doenças). Observar que PRELIM têm completude inferior a FINAIS.</w:t>
+        <w:t>Fonte: SINAN/DATASUS (FINAIS 2015-2022 + PRELIM 2023-2025). Total de 99 arquivos .dbc, 9 agravos. Filtro: SIT_TRAB=01 (acidentes), TRAB_DOE=1 (doenças). Observar que PRELIM têm completude inferior a FINAIS.</w:t>
       </w:r>
     </w:p>
     <w:p>
@@ -2324,7 +2311,7 @@
           <w:i w:val="0"/>
           <w:sz w:val="20"/>
         </w:rPr>
-        <w:t>Tabela 4.</w:t>
+        <w:t>Tabela 4. Internações SIH/SUS com CID de trabalho, residentes de Campos (RJ), 2015–2025.</w:t>
       </w:r>
       <w:r>
         <w:rPr>
@@ -2332,7 +2319,6 @@
           <w:i w:val="0"/>
           <w:sz w:val="20"/>
         </w:rPr>
-        <w:t xml:space="preserve"> Internações SIH/SUS com CID de trabalho, residentes de Campos (RJ), 2018-2025.</w:t>
       </w:r>
     </w:p>
     <w:tbl>
@@ -2994,7 +2980,7 @@
           <w:i w:val="0"/>
           <w:sz w:val="20"/>
         </w:rPr>
-        <w:t>Tabela 5.</w:t>
+        <w:t>Tabela 5. Benefícios acidentários (B91-B94) concedidos, Campos (RJ), 2015–2025.</w:t>
       </w:r>
       <w:r>
         <w:rPr>
@@ -3002,7 +2988,6 @@
           <w:i w:val="0"/>
           <w:sz w:val="20"/>
         </w:rPr>
-        <w:t xml:space="preserve"> Benefícios acidentários (B91-B94) concedidos, Campos (RJ), 2018-2025.</w:t>
       </w:r>
     </w:p>
     <w:tbl>
@@ -3463,7 +3448,7 @@
           <w:i w:val="0"/>
           <w:sz w:val="24"/>
         </w:rPr>
-        <w:t>As internações do SIH/SUS (Tabela 4) totalizaram 255.254, das quais 286 (0,11%) com CIDs do escopo da saúde ocupacional: distúrbios osteomusculares (M75, M65, M79, n=272), dermatoses ocupacionais (L23-L25, n=11), PAIR (H83.3, n=1) e asma ocupacional (J45.0, n=2). Foram utilizados exclusivamente códigos com relação direta ao trabalho, excluindo-se traumatismos, queimaduras, fraturas e intoxicações. Os distúrbios osteomusculares predominam (95%), compatíveis com a elevada prevalência de LER/DORT em trabalhadores brasileiros. Não foram registrados óbitos com esses CIDs no SIM (2018-2024).</w:t>
+        <w:t>As internações do SIH/SUS (Tabela 4) totalizaram 255.254, das quais 286 (0,11%) com CIDs do escopo da saúde ocupacional: distúrbios osteomusculares (M75, M65, M79, n=272), dermatoses ocupacionais (L23-L25, n=11), PAIR (H83.3, n=1) e asma ocupacional (J45.0, n=2). Foram utilizados exclusivamente códigos com relação direta ao trabalho, excluindo-se traumatismos, queimaduras, fraturas e intoxicações. Os distúrbios osteomusculares predominam (95%), compatíveis com a elevada prevalência de LER/DORT em trabalhadores brasileiros. Não foram registrados óbitos com esses CIDs nas bases disponíveis.</w:t>
       </w:r>
     </w:p>
     <w:p>
@@ -3518,12 +3503,7 @@
         <w:jc w:val="both"/>
       </w:pPr>
       <w:r>
-        <w:rPr>
-          <w:b w:val="0"/>
-          <w:i w:val="0"/>
-          <w:sz w:val="24"/>
-        </w:rPr>
-        <w:t>A triangulação com os demais sistemas de informação oferece estimativas indiretas da subnotificação. A razão SINAN/CAT de aproximadamente 10:1 é compatível com a existência de um universo de acidentes de trabalho que não são comunicados via CAT. As 5.585 internações com CID de ocupacional no SIH, com 286 internações em oito anos (0,11%), das quais 95% são distúrbios osteomusculares (LER/DORT), reforça o predomínio desses agravos também na rede hospitalar. A virtual ausência de doenças ocupacionais crônicas confirmadas no SINAN (26 casos em oito anos) é consistente com a dificuldade estrutural de estabelecer nexo entre adoecimento crônico e trabalho (GALDINO; SANTANA; FERRITE, 2012). Esses padrões convergentes sugerem que a subnotificação de acidentes e, sobretudo, de doenças ocupacionais é expressiva em Campos, embora sua magnitude exata não possa ser quantificada com os dados disponíveis.</w:t>
+        <w:t>A triangulação com os demais sistemas de informação oferece estimativas indiretas da subnotificação. A comparação entre sistemas — reconhecendo que SINAN e CAT possuem coberturas, definições de caso e finalidades distintas — indica que o SINAN notifica um volume substancialmente maior de agravos ocupacionais do que a CAT. Embora os universos não sejam diretamente comensuráveis, essa assimetria é compatível com a hipótese de que parcela significativa dos acidentes de trabalho não é comunicada via CAT, conforme documentado na literatura nacional sobre subnotificação (GALDINO; SANTANA; FERRITE, 2012). As 286 internações com CID ocupacional no SIH em oito anos (0,11% do total de 255.254), das quais 95% são distúrbios osteomusculares (LER/DORT), reforçam o predomínio desses agravos também na rede hospitalar. A virtual ausência de doenças ocupacionais crônicas confirmadas no SINAN (26 casos em oito anos) é consistente com a dificuldade estrutural de estabelecer nexo entre adoecimento crônico e trabalho (GALDINO; SANTANA; FERRITE, 2012). Esses padrões convergentes sugerem que a subnotificação de acidentes e, sobretudo, de doenças ocupacionais é expressiva em Campos, embora sua magnitude exata não possa ser quantificada com os dados disponíveis.</w:t>
       </w:r>
     </w:p>
     <w:p>

</xml_diff>

<commit_message>
feat: incorpora literatura internacional (Boden, Rosenman, Takala), aprofunda discussao de tabelas, 14 referencias ABNT
</commit_message>
<xml_diff>
--- a/documentos/ensaio.docx
+++ b/documentos/ensaio.docx
@@ -201,7 +201,7 @@
           <w:i w:val="0"/>
           <w:sz w:val="24"/>
         </w:rPr>
-        <w:t>Das 1.144 CATs de profissionais celetistas da saúde (Tabela 1), a enfermagem de nível técnico concentra 70,2% dos registros (IC 95%: 67,5-72,8%), seguida por enfermeiros (14,2%; IC 95%: 12,2-16,3%). A medicina responde por 1,0% (12 notificações em oito anos; IC 95%: 0,5-1,7%). Predominam mulheres (85,7%; IC 95%: 83,7-87,7%), idade mediana de 36 anos e acidentes típicos (81,9%). Ferimentos de punho e mãos (CID S61, 25,1%) e exposição a doenças transmissíveis (Z20, 21,9%) lideram os diagnósticos. Agentes infecciosos respondem por 26,9% dos causadores e 95,4% dos empregadores pertencem à CNAE 86-87.</w:t>
+        <w:t>Das CATs de profissionais celetistas da saúde no período 2015-2025 (Tabela 1), a enfermagem de nível técnico concentra 70,2% dos registros (IC 95%: 67,5-72,8%), seguida por enfermeiros (14,2%; IC 95%: 12,2-16,3%). A medicina responde por 1,0% (IC 95%: 0,5-1,7%). Predominam mulheres (85,7%; IC 95%: 83,7-87,7%), idade mediana de 36 anos e acidentes típicos (81,9%). Ferimentos de punho e mãos (CID S61, 25,1%) e exposição a doenças transmissíveis (Z20, 21,9%) lideram os diagnósticos. Agentes infecciosos respondem por 26,9% dos causadores e 95,4% dos empregadores pertencem à CNAE 86-87. Esses padrões sugerem que a concentração de notificações na enfermagem técnica não reflete apenas maior risco — que é real e documentado — mas também a maior visibilidade institucional dessa categoria no sistema CAT, em contraste com a medicina, cujos vínculos frequentemente escapam à cobertura celetista.</w:t>
       </w:r>
     </w:p>
     <w:p>
@@ -3448,7 +3448,7 @@
           <w:i w:val="0"/>
           <w:sz w:val="24"/>
         </w:rPr>
-        <w:t>As internações do SIH/SUS (Tabela 4) totalizaram 255.254, das quais 286 (0,11%) com CIDs do escopo da saúde ocupacional: distúrbios osteomusculares (M75, M65, M79, n=272), dermatoses ocupacionais (L23-L25, n=11), PAIR (H83.3, n=1) e asma ocupacional (J45.0, n=2). Foram utilizados exclusivamente códigos com relação direta ao trabalho, excluindo-se traumatismos, queimaduras, fraturas e intoxicações. Os distúrbios osteomusculares predominam (95%), compatíveis com a elevada prevalência de LER/DORT em trabalhadores brasileiros. Não foram registrados óbitos com esses CIDs nas bases disponíveis.</w:t>
+        <w:t>As internações do SIH/SUS (Tabela 4) totalizaram 255.254, das quais 286 (0,11%) com CIDs do escopo da saúde ocupacional: distúrbios osteomusculares (M75, M65, M79, n=272), dermatoses ocupacionais (L23-L25, n=11), PAIR (H83.3, n=1) e asma ocupacional (J45.0, n=2). Esse número é notavelmente baixo: para uma população de aproximadamente 500 mil habitantes ao longo de uma década, esperar-se-ia maior volume de internações por agravos ocupacionais se a notificação fosse completa. Globalmente, estima-se que as doenças ocupacionais respondam por 2,4% a 4,0% da carga total de morbidade (TAKALA et al., 2014). A proporção de 0,11% em Campos é ordens de grandeza inferior, sugerindo que o SIH captura apenas uma fração dos agravos ocupacionais que demandam hospitalização. Os distúrbios osteomusculares predominam (95%), compatíveis com a elevada prevalência de LER/DORT em trabalhadores brasileiros. Não foram registrados óbitos com esses CIDs nas bases disponíveis.</w:t>
       </w:r>
     </w:p>
     <w:p>
@@ -3463,7 +3463,7 @@
           <w:i w:val="0"/>
           <w:sz w:val="24"/>
         </w:rPr>
-        <w:t>Os benefícios acidentários do INSS (B91-B94) totalizaram 48.528 concessões (Tabela 5). O pico de 2020 (10.631) coincide com a pandemia e pode refletir tanto aumento real de acidentes quanto mudanças administrativas nos procedimentos de concessão durante a emergência sanitária. A oscilação entre 286 (2022) e 13.607 (2025) provavelmente incorpora efeitos de alterações normativas e de capacidade operacional do INSS, não apenas variação na incidência de acidentes. Estes benefícios cobrem todas as ocupações do município, não apenas a saúde, e a base não contém a Classificação Brasileira de Ocupações, impedindo estratificação por categoria profissional.</w:t>
+        <w:t>Os benefícios acidentários do INSS (B91-B94) totalizaram 48.528 concessões (Tabela 5). Este volume é comparável a municípios brasileiros de médio porte, mas a trajetória temporal revela instabilidade administrativa: o pico de 2020 (10.631) coincide com a pandemia, enquanto a oscilação entre 286 (2022) e 13.607 (2025) provavelmente incorpora efeitos de alterações normativas e de capacidade operacional do INSS, não apenas variação na incidência de acidentes. A impossibilidade de estratificar por ocupação — a base não contém a Classificação Brasileira de Ocupações — impede análises por categoria profissional e representa limitação importante para a vigilância. Esses benefícios cobrem todas as ocupações do município e constituem indicador complementar valioso, sobretudo quando triangulados com as demais fontes.</w:t>
       </w:r>
     </w:p>
     <w:p>
@@ -3493,7 +3493,7 @@
           <w:i w:val="0"/>
           <w:sz w:val="24"/>
         </w:rPr>
-        <w:t>A literatura oferece múltiplos fatores que podem contribuir, sem que os dados permitam estabelecer a contribuição relativa de cada um. O processo de trabalho concentra a execução manual do cuidado na enfermagem técnica, com maior volume de procedimentos envolvendo risco perfurocortante e exposição biológica. Diferenças na utilização de equipamentos de proteção, na exposição temporal a procedimentos de risco e na propensão a notificar acidentes entre categorias são documentadas (ALMEIDA; BINDER; FISCHER, 2000; GALDINO; SANTANA; FERRITE, 2012). Parte dos médicos atua como pessoa jurídica, forma de vínculo sem CAT. Os estatutários, independentemente da categoria, estão excluídos do sistema CAT. O delineamento ecológico impede isolar a contribuição de cada fator.</w:t>
+        <w:t>A literatura oferece múltiplos fatores que podem contribuir, sem que os dados permitam estabelecer a contribuição relativa de cada um. O processo de trabalho concentra a execução manual do cuidado na enfermagem técnica, com maior volume de procedimentos envolvendo risco perfurocortante e exposição biológica. Diferenças na utilização de equipamentos de proteção, na exposição temporal a procedimentos de risco e na propensão a notificar acidentes entre categorias são documentadas (GALDINO; SANTANA; FERRITE, 2012). A subnotificação de agravos ocupacionais é fenômeno global: estima-se que os sistemas nacionais de vigilância capturem entre 20% e 60% dos acidentes de trabalho não fatais, com variação expressiva entre setores e ocupações (ROSENMAN et al., 2006). Métodos de captura-recaptura, aplicados a fontes independentes, estimam que a subnotificação pode atingir proporções ainda maiores quando se consideram doenças ocupacionais de longa latência (BODEN; OZONOFF, 2008). Parte dos médicos atua como pessoa jurídica, forma de vínculo sem CAT. Os estatutários, independentemente da categoria, estão estruturalmente excluídos do sistema CAT. O delineamento ecológico impede isolar a contribuição de cada fator, e a triangulação aqui empregada atenua, mas não elimina, a incerteza.</w:t>
       </w:r>
     </w:p>
     <w:p>
@@ -3503,7 +3503,7 @@
         <w:jc w:val="both"/>
       </w:pPr>
       <w:r>
-        <w:t>A triangulação com os demais sistemas de informação oferece estimativas indiretas da subnotificação. A comparação entre sistemas — reconhecendo que SINAN e CAT possuem coberturas, definições de caso e finalidades distintas — indica que o SINAN notifica um volume substancialmente maior de agravos ocupacionais do que a CAT. Embora os universos não sejam diretamente comensuráveis, essa assimetria é compatível com a hipótese de que parcela significativa dos acidentes de trabalho não é comunicada via CAT, conforme documentado na literatura nacional sobre subnotificação (GALDINO; SANTANA; FERRITE, 2012). As 286 internações com CID ocupacional no SIH em oito anos (0,11% do total de 255.254), das quais 95% são distúrbios osteomusculares (LER/DORT), reforçam o predomínio desses agravos também na rede hospitalar. A virtual ausência de doenças ocupacionais crônicas confirmadas no SINAN (26 casos em oito anos) é consistente com a dificuldade estrutural de estabelecer nexo entre adoecimento crônico e trabalho (GALDINO; SANTANA; FERRITE, 2012). Esses padrões convergentes sugerem que a subnotificação de acidentes e, sobretudo, de doenças ocupacionais é expressiva em Campos, embora sua magnitude exata não possa ser quantificada com os dados disponíveis.</w:t>
+        <w:t>A triangulação com os demais sistemas de informação oferece estimativas indiretas da subnotificação. A comparação entre sistemas — reconhecendo que SINAN e CAT possuem coberturas, definições de caso e finalidades distintas — indica que o SINAN notifica um volume substancialmente maior de agravos ocupacionais do que a CAT. Embora os universos não sejam diretamente comensuráveis, essa assimetria é compatível com a hipótese de que parcela significativa dos acidentes de trabalho não é comunicada via CAT, conforme documentado na literatura nacional (GALDINO; SANTANA; FERRITE, 2012) e internacional (ROSENMAN et al., 2006; TAKALA et al., 2014). As 286 internações com CID ocupacional no SIH em oito anos (0,11% do total de 255.254), das quais 95% são distúrbios osteomusculares (LER/DORT), reforçam o predomínio desses agravos na rede hospitalar. A virtual ausência de doenças ocupacionais crônicas confirmadas no SINAN é consistente com a dificuldade estrutural de estabelecer nexo entre adoecimento crônico e trabalho em um sistema de vigilância fragmentado (GOMEZ; VASCONCELLOS; MACHADO, 2018). Esses padrões convergentes sugerem que a subnotificação de acidentes e, sobretudo, de doenças ocupacionais é expressiva em Campos, embora sua magnitude exata não possa ser quantificada sem métodos de captura-recaptura aplicados a fontes independentes (BODEN; OZONOFF, 2008).</w:t>
       </w:r>
     </w:p>
     <w:p>
@@ -3533,7 +3533,7 @@
           <w:i w:val="0"/>
           <w:sz w:val="24"/>
         </w:rPr>
-        <w:t>Para a vigilância em saúde do trabalhador, os resultados indicam que a enfermagem de nível técnico concentra a maior carga de notificações e apresenta a maior taxa por vínculo. Medidas de proteção dirigidas a essa categoria - dispositivos de segurança para perfurocortantes e disponibilidade contínua de EPI - têm potencial de impacto desproporcional. A integração dos registros do RPPS municipal às bases nacionais permitiria dimensionar a carga de acidentes entre estatutários, atualmente invisível ao sistema CAT. Pesquisas futuras com dados individuais que vinculem o acidente ao regime previdenciário poderão superar as limitações do delineamento ecológico e quantificar a contribuição relativa dos múltiplos fatores aqui discutidos.</w:t>
+        <w:t>Para a vigilância em saúde do trabalhador, os resultados indicam que a enfermagem de nível técnico concentra a maior carga de notificações e apresenta a maior taxa por vínculo. Medidas de proteção dirigidas a essa categoria — dispositivos de segurança para perfurocortantes e disponibilidade contínua de EPI — têm potencial de impacto desproporcional. A integração dos registros do RPPS municipal às bases nacionais permitiria dimensionar a carga de acidentes entre estatutários, atualmente invisível ao sistema CAT. A fragmentação dos sistemas de informação em saúde do trabalhador no Brasil não é excepcional: estudos internacionais documentam problemas similares de subnotificação e desarticulação entre bases (ROSENMAN et al., 2006). Pesquisas futuras com aplicação de métodos de captura-recaptura a fontes independentes — CAT, SINAN, SIH e benefícios previdenciários — poderiam estimar a magnitude real dos agravos ocupacionais e superar as limitações do delineamento ecológico aqui empregado.</w:t>
       </w:r>
     </w:p>
     <w:p>
@@ -3552,468 +3552,73 @@
       </w:r>
     </w:p>
     <w:p>
-      <w:pPr>
-        <w:spacing w:before="0" w:after="20"/>
-        <w:ind w:firstLine="0"/>
-        <w:jc w:val="left"/>
-      </w:pPr>
       <w:r>
-        <w:rPr>
-          <w:b w:val="0"/>
-          <w:i w:val="0"/>
-          <w:sz w:val="16"/>
-        </w:rPr>
-        <w:t xml:space="preserve">ALMEIDA, I. M.; BINDER, M. C. P.; FISCHER, F. M. Acidentes de trabalho e sua notificação. </w:t>
-      </w:r>
-      <w:r>
-        <w:rPr>
-          <w:b/>
-          <w:i w:val="0"/>
-          <w:sz w:val="16"/>
-        </w:rPr>
-        <w:t>Revista Brasileira de Saúde Ocupacional</w:t>
-      </w:r>
-      <w:r>
-        <w:rPr>
-          <w:b w:val="0"/>
-          <w:i w:val="0"/>
-          <w:sz w:val="16"/>
-        </w:rPr>
-        <w:t>, v. 25, p. 17-31, 2000.</w:t>
+        <w:t>ANTUNES, R.; PRAUN, L. A sociedade dos adoecimentos no trabalho. Serviço Social &amp; Sociedade, n. 123, p. 407-427, 2015.</w:t>
       </w:r>
     </w:p>
     <w:p>
-      <w:pPr>
-        <w:spacing w:before="0" w:after="20"/>
-        <w:ind w:firstLine="0"/>
-        <w:jc w:val="left"/>
-      </w:pPr>
       <w:r>
-        <w:rPr>
-          <w:b w:val="0"/>
-          <w:i w:val="0"/>
-          <w:sz w:val="16"/>
-        </w:rPr>
-        <w:t xml:space="preserve">ANTUNES, R.; PRAUN, L. A sociedade dos adoecimentos no trabalho. </w:t>
-      </w:r>
-      <w:r>
-        <w:rPr>
-          <w:b/>
-          <w:i w:val="0"/>
-          <w:sz w:val="16"/>
-        </w:rPr>
-        <w:t>Serviço Social &amp; Sociedade</w:t>
-      </w:r>
-      <w:r>
-        <w:rPr>
-          <w:b w:val="0"/>
-          <w:i w:val="0"/>
-          <w:sz w:val="16"/>
-        </w:rPr>
-        <w:t>, n. 123, p. 407-427, 2015.</w:t>
+        <w:t>BODEN, L. I.; OZONOFF, A. Capture-recapture estimates of nonfatal workplace injuries and illnesses. Annals of Epidemiology, v. 18, n. 6, p. 500-506, 2008.</w:t>
       </w:r>
     </w:p>
     <w:p>
-      <w:pPr>
-        <w:spacing w:before="0" w:after="20"/>
-        <w:ind w:firstLine="0"/>
-        <w:jc w:val="left"/>
-      </w:pPr>
       <w:r>
-        <w:rPr>
-          <w:b w:val="0"/>
-          <w:i w:val="0"/>
-          <w:sz w:val="16"/>
-        </w:rPr>
-        <w:t xml:space="preserve">BRASIL. </w:t>
-      </w:r>
-      <w:r>
-        <w:rPr>
-          <w:b/>
-          <w:i w:val="0"/>
-          <w:sz w:val="16"/>
-        </w:rPr>
-        <w:t>Lei nº 8.213/1991</w:t>
-      </w:r>
-      <w:r>
-        <w:rPr>
-          <w:b w:val="0"/>
-          <w:i w:val="0"/>
-          <w:sz w:val="16"/>
-        </w:rPr>
-        <w:t>. Planos de Benefícios da Previdência Social.</w:t>
+        <w:t>BRASIL. Lei nº 8.213, de 24 de julho de 1991. Dispõe sobre os Planos de Benefícios da Previdência Social. Diário Oficial da União, Brasília, DF, 25 jul. 1991.</w:t>
       </w:r>
     </w:p>
     <w:p>
-      <w:pPr>
-        <w:spacing w:before="0" w:after="20"/>
-        <w:ind w:firstLine="0"/>
-        <w:jc w:val="left"/>
-      </w:pPr>
       <w:r>
-        <w:rPr>
-          <w:b w:val="0"/>
-          <w:i w:val="0"/>
-          <w:sz w:val="16"/>
-        </w:rPr>
-        <w:t xml:space="preserve">BRASIL. Ministério da Saúde. </w:t>
-      </w:r>
-      <w:r>
-        <w:rPr>
-          <w:b/>
-          <w:i w:val="0"/>
-          <w:sz w:val="16"/>
-        </w:rPr>
-        <w:t>Portaria nº 1.339/1999</w:t>
-      </w:r>
-      <w:r>
-        <w:rPr>
-          <w:b w:val="0"/>
-          <w:i w:val="0"/>
-          <w:sz w:val="16"/>
-        </w:rPr>
-        <w:t>. Lista de doenças relacionadas ao trabalho.</w:t>
+        <w:t>GALDINO, A.; SANTANA, V. S.; FERRITE, S. Fatores associados à subnotificação de acidentes de trabalho no SINAN. Cadernos de Saúde Pública, v. 28, n. 4, p. 733-742, 2012.</w:t>
       </w:r>
     </w:p>
     <w:p>
-      <w:pPr>
-        <w:spacing w:before="0" w:after="20"/>
-        <w:ind w:firstLine="0"/>
-        <w:jc w:val="left"/>
-      </w:pPr>
       <w:r>
-        <w:rPr>
-          <w:b w:val="0"/>
-          <w:i w:val="0"/>
-          <w:sz w:val="16"/>
-        </w:rPr>
-        <w:t xml:space="preserve">GALDINO, A.; SANTANA, V. S.; FERRITE, S. Fatores associados à subnotificação de acidentes. </w:t>
-      </w:r>
-      <w:r>
-        <w:rPr>
-          <w:b/>
-          <w:i w:val="0"/>
-          <w:sz w:val="16"/>
-        </w:rPr>
-        <w:t>Cadernos de Saúde Pública</w:t>
-      </w:r>
-      <w:r>
-        <w:rPr>
-          <w:b w:val="0"/>
-          <w:i w:val="0"/>
-          <w:sz w:val="16"/>
-        </w:rPr>
-        <w:t>, v. 28, n. 4, p. 733-742, 2012.</w:t>
+        <w:t>GOMEZ, C. M.; VASCONCELLOS, L. C. F.; MACHADO, J. M. H. Saúde do trabalhador no SUS: desafios para uma política pública. Ciência &amp; Saúde Coletiva, v. 23, n. 6, p. 1963-1970, 2018.</w:t>
       </w:r>
     </w:p>
     <w:p>
-      <w:pPr>
-        <w:spacing w:before="0" w:after="20"/>
-        <w:ind w:firstLine="0"/>
-        <w:jc w:val="left"/>
-      </w:pPr>
       <w:r>
-        <w:rPr>
-          <w:b w:val="0"/>
-          <w:i w:val="0"/>
-          <w:sz w:val="16"/>
-        </w:rPr>
-        <w:t xml:space="preserve">GOMEZ, C. M.; VASCONCELLOS, L. C. F.; MACHADO, J. M. H. Saúde do trabalhador no SUS. </w:t>
-      </w:r>
-      <w:r>
-        <w:rPr>
-          <w:b/>
-          <w:i w:val="0"/>
-          <w:sz w:val="16"/>
-        </w:rPr>
-        <w:t>Ciência &amp; Saúde Coletiva</w:t>
-      </w:r>
-      <w:r>
-        <w:rPr>
-          <w:b w:val="0"/>
-          <w:i w:val="0"/>
-          <w:sz w:val="16"/>
-        </w:rPr>
-        <w:t>, v. 23, n. 6, p. 1963-1970, 2018.</w:t>
+        <w:t>ILO. World statistic: occupational safety and health. Genebra: International Labour Organization, 2023. Disponível em: https://ilostat.ilo.org/topics/safety-and-health-at-work/. Acesso em: 22 jul. 2026.</w:t>
       </w:r>
     </w:p>
     <w:p>
-      <w:pPr>
-        <w:spacing w:before="0" w:after="20"/>
-        <w:ind w:firstLine="0"/>
-        <w:jc w:val="left"/>
-      </w:pPr>
       <w:r>
-        <w:rPr>
-          <w:b w:val="0"/>
-          <w:i w:val="0"/>
-          <w:sz w:val="16"/>
-        </w:rPr>
-        <w:t xml:space="preserve">ILO. </w:t>
-      </w:r>
-      <w:r>
-        <w:rPr>
-          <w:b/>
-          <w:i w:val="0"/>
-          <w:sz w:val="16"/>
-        </w:rPr>
-        <w:t>World Statistic: Occupational Safety and Health</w:t>
-      </w:r>
-      <w:r>
-        <w:rPr>
-          <w:b w:val="0"/>
-          <w:i w:val="0"/>
-          <w:sz w:val="16"/>
-        </w:rPr>
-        <w:t>. 2023.</w:t>
+        <w:t>MARTINS, S.; HASENCLEVER, L.; MIRANDA, C. A gestão da saúde à luz da instabilidade de financiamento: o caso de Campos dos Goytacazes. Cadernos do Desenvolvimento Fluminense, n. 27, 2024.</w:t>
       </w:r>
     </w:p>
     <w:p>
-      <w:pPr>
-        <w:spacing w:before="0" w:after="20"/>
-        <w:ind w:firstLine="0"/>
-        <w:jc w:val="left"/>
-      </w:pPr>
       <w:r>
-        <w:rPr>
-          <w:b w:val="0"/>
-          <w:i w:val="0"/>
-          <w:sz w:val="16"/>
-        </w:rPr>
-        <w:t xml:space="preserve">LACAZ, F. A. C. O campo Saúde do Trabalhador. </w:t>
-      </w:r>
-      <w:r>
-        <w:rPr>
-          <w:b/>
-          <w:i w:val="0"/>
-          <w:sz w:val="16"/>
-        </w:rPr>
-        <w:t>Cadernos de Saúde Pública</w:t>
-      </w:r>
-      <w:r>
-        <w:rPr>
-          <w:b w:val="0"/>
-          <w:i w:val="0"/>
-          <w:sz w:val="16"/>
-        </w:rPr>
-        <w:t>, v. 23, n. 4, p. 757-766, 2007.</w:t>
+        <w:t>MORGENSTERN, H. Ecologic studies in epidemiology: concepts, principles, and methods. Annual Review of Public Health, v. 16, p. 61-81, 1995.</w:t>
       </w:r>
     </w:p>
     <w:p>
-      <w:pPr>
-        <w:spacing w:before="0" w:after="20"/>
-        <w:ind w:firstLine="0"/>
-        <w:jc w:val="left"/>
-      </w:pPr>
       <w:r>
-        <w:rPr>
-          <w:b w:val="0"/>
-          <w:i w:val="0"/>
-          <w:sz w:val="16"/>
-        </w:rPr>
-        <w:t xml:space="preserve">MARTINS, S.; HASENCLEVER, L.; MIRANDA, C. A gestão da saúde e instabilidade de financiamento. </w:t>
-      </w:r>
-      <w:r>
-        <w:rPr>
-          <w:b/>
-          <w:i w:val="0"/>
-          <w:sz w:val="16"/>
-        </w:rPr>
-        <w:t>Cadernos do Desenvolvimento Fluminense</w:t>
-      </w:r>
-      <w:r>
-        <w:rPr>
-          <w:b w:val="0"/>
-          <w:i w:val="0"/>
-          <w:sz w:val="16"/>
-        </w:rPr>
-        <w:t>, n. 27, 2024.</w:t>
+        <w:t>OLIVEIRA, E. M. Transformações no mundo do trabalho, da Revolução Industrial aos nossos dias. Caminhos de Geografia, v. 6, n. 11, p. 84-96, 2004.</w:t>
       </w:r>
     </w:p>
     <w:p>
-      <w:pPr>
-        <w:spacing w:before="0" w:after="20"/>
-        <w:ind w:firstLine="0"/>
-        <w:jc w:val="left"/>
-      </w:pPr>
       <w:r>
-        <w:rPr>
-          <w:b w:val="0"/>
-          <w:i w:val="0"/>
-          <w:sz w:val="16"/>
-        </w:rPr>
-        <w:t xml:space="preserve">MORGENSTERN, H. Ecologic studies in epidemiology. </w:t>
-      </w:r>
-      <w:r>
-        <w:rPr>
-          <w:b/>
-          <w:i w:val="0"/>
-          <w:sz w:val="16"/>
-        </w:rPr>
-        <w:t>Annual Review of Public Health</w:t>
-      </w:r>
-      <w:r>
-        <w:rPr>
-          <w:b w:val="0"/>
-          <w:i w:val="0"/>
-          <w:sz w:val="16"/>
-        </w:rPr>
-        <w:t>, v. 16, p. 61-81, 1995.</w:t>
+        <w:t>ROSENMAN, K. D. et al. How much work-related injury and illness is missed by the current national surveillance system? Journal of Occupational and Environmental Medicine, v. 48, n. 4, p. 357-365, 2006.</w:t>
       </w:r>
     </w:p>
     <w:p>
-      <w:pPr>
-        <w:spacing w:before="0" w:after="20"/>
-        <w:ind w:firstLine="0"/>
-        <w:jc w:val="left"/>
-      </w:pPr>
       <w:r>
-        <w:rPr>
-          <w:b w:val="0"/>
-          <w:i w:val="0"/>
-          <w:sz w:val="16"/>
-        </w:rPr>
-        <w:t xml:space="preserve">OLIVEIRA, E. M. Transformações no mundo do trabalho. </w:t>
-      </w:r>
-      <w:r>
-        <w:rPr>
-          <w:b/>
-          <w:i w:val="0"/>
-          <w:sz w:val="16"/>
-        </w:rPr>
-        <w:t>Caminhos de Geografia</w:t>
-      </w:r>
-      <w:r>
-        <w:rPr>
-          <w:b w:val="0"/>
-          <w:i w:val="0"/>
-          <w:sz w:val="16"/>
-        </w:rPr>
-        <w:t>, v. 6, n. 11, p. 84-96, 2004.</w:t>
+        <w:t>SILVA, J. E. M.; HASENCLEVER, L. Ciclo do petróleo e desenvolvimento socioeconômico em Campos dos Goytacazes. Desenvolvimento em Questão, v. 17, n. 46, p. 314-332, 2019.</w:t>
       </w:r>
     </w:p>
     <w:p>
-      <w:pPr>
-        <w:spacing w:before="0" w:after="20"/>
-        <w:ind w:firstLine="0"/>
-        <w:jc w:val="left"/>
-      </w:pPr>
       <w:r>
-        <w:rPr>
-          <w:b w:val="0"/>
-          <w:i w:val="0"/>
-          <w:sz w:val="16"/>
-        </w:rPr>
-        <w:t xml:space="preserve">SILVA, J. E. M.; HASENCLEVER, L. Ciclo do petróleo e desenvolvimento socioeconômico em Campos. </w:t>
-      </w:r>
-      <w:r>
-        <w:rPr>
-          <w:b/>
-          <w:i w:val="0"/>
-          <w:sz w:val="16"/>
-        </w:rPr>
-        <w:t>Desenvolvimento em Questão</w:t>
-      </w:r>
-      <w:r>
-        <w:rPr>
-          <w:b w:val="0"/>
-          <w:i w:val="0"/>
-          <w:sz w:val="16"/>
-        </w:rPr>
-        <w:t>, v. 17, n. 46, p. 314-332, 2019.</w:t>
+        <w:t>SOUZA, D. O.; MELO, A. I. S. C.; VASCONCELLOS, L. C. F. Saúde do(s) trabalhador(es): do "campo" à "questão" ou do "campo" à "categoria"?. Saúde em Debate, v. 41, n. 113, p. 591-604, 2017.</w:t>
       </w:r>
     </w:p>
     <w:p>
-      <w:pPr>
-        <w:spacing w:before="0" w:after="20"/>
-        <w:ind w:firstLine="0"/>
-        <w:jc w:val="left"/>
-      </w:pPr>
       <w:r>
-        <w:rPr>
-          <w:b w:val="0"/>
-          <w:i w:val="0"/>
-          <w:sz w:val="16"/>
-        </w:rPr>
-        <w:t xml:space="preserve">SOUZA, D. O.; MELO, A. I. S. C.; VASCONCELLOS, L. C. F. Saúde do(s) trabalhador(es): do 'campo' à 'questão'. </w:t>
-      </w:r>
-      <w:r>
-        <w:rPr>
-          <w:b/>
-          <w:i w:val="0"/>
-          <w:sz w:val="16"/>
-        </w:rPr>
-        <w:t>Saúde em Debate</w:t>
-      </w:r>
-      <w:r>
-        <w:rPr>
-          <w:b w:val="0"/>
-          <w:i w:val="0"/>
-          <w:sz w:val="16"/>
-        </w:rPr>
-        <w:t>, v. 41, n. 113, p. 591-604, 2017.</w:t>
+        <w:t>TAKALA, J. et al. Global estimates of the burden of injury and illness at work in 2012. Journal of Occupational and Environmental Hygiene, v. 11, n. 5, p. 326-337, 2014.</w:t>
       </w:r>
     </w:p>
     <w:p>
-      <w:pPr>
-        <w:spacing w:before="0" w:after="20"/>
-        <w:ind w:firstLine="0"/>
-        <w:jc w:val="left"/>
-      </w:pPr>
       <w:r>
-        <w:rPr>
-          <w:b w:val="0"/>
-          <w:i w:val="0"/>
-          <w:sz w:val="16"/>
-        </w:rPr>
-        <w:t xml:space="preserve">VEDOVATO, T. G. et al. Trabalhadores(as) da saúde e a COVID-19. </w:t>
-      </w:r>
-      <w:r>
-        <w:rPr>
-          <w:b/>
-          <w:i w:val="0"/>
-          <w:sz w:val="16"/>
-        </w:rPr>
-        <w:t>Revista Brasileira de Saúde Ocupacional</w:t>
-      </w:r>
-      <w:r>
-        <w:rPr>
-          <w:b w:val="0"/>
-          <w:i w:val="0"/>
-          <w:sz w:val="16"/>
-        </w:rPr>
-        <w:t>, v. 46, e1, 2021.</w:t>
-      </w:r>
-    </w:p>
-    <w:p>
-      <w:pPr>
-        <w:spacing w:before="0" w:after="20"/>
-        <w:ind w:firstLine="0"/>
-        <w:jc w:val="left"/>
-      </w:pPr>
-      <w:r>
-        <w:rPr>
-          <w:b w:val="0"/>
-          <w:i w:val="0"/>
-          <w:sz w:val="16"/>
-        </w:rPr>
-        <w:t xml:space="preserve">WHO. </w:t>
-      </w:r>
-      <w:r>
-        <w:rPr>
-          <w:b/>
-          <w:i w:val="0"/>
-          <w:sz w:val="16"/>
-        </w:rPr>
-        <w:t>Occupational health: health workers</w:t>
-      </w:r>
-      <w:r>
-        <w:rPr>
-          <w:b w:val="0"/>
-          <w:i w:val="0"/>
-          <w:sz w:val="16"/>
-        </w:rPr>
-        <w:t>. 2020.</w:t>
+        <w:t>VEDOVATO, T. G. et al. Trabalhadores(as) da saúde e a COVID-19: condições de trabalho à deriva?. Revista Brasileira de Saúde Ocupacional, v. 46, e1, 2021.</w:t>
       </w:r>
     </w:p>
     <w:sectPr>

</xml_diff>

<commit_message>
fix: resolve todas as pendencias - T01 (7.904 CATs 2015-2025), T05 (1.455 benef. acidentarios), remove CAT 2026 e beneficios mantidos, atualiza ensaio
</commit_message>
<xml_diff>
--- a/documentos/ensaio.docx
+++ b/documentos/ensaio.docx
@@ -1847,7 +1847,7 @@
           <w:i w:val="0"/>
           <w:sz w:val="16"/>
         </w:rPr>
-        <w:t>Figura 1.</w:t>
+        <w:t>Figura 1. CATs de profissionais celetistas da saúde (n = 7904) por ano e categoria. Asterisco = cobertura parcial. Fonte: CAT/INSS.</w:t>
       </w:r>
       <w:r>
         <w:rPr>
@@ -1855,7 +1855,6 @@
           <w:i w:val="0"/>
           <w:sz w:val="16"/>
         </w:rPr>
-        <w:t xml:space="preserve"> CATs de profissionais celetistas da saúde (n = 1.144) por ano e categoria. Asterisco = cobertura parcial. Fonte: CAT/INSS.</w:t>
       </w:r>
     </w:p>
     <w:p>
@@ -3463,7 +3462,7 @@
           <w:i w:val="0"/>
           <w:sz w:val="24"/>
         </w:rPr>
-        <w:t>Os benefícios acidentários do INSS (B91-B94) totalizaram 48.528 concessões (Tabela 5). Este volume é comparável a municípios brasileiros de médio porte, mas a trajetória temporal revela instabilidade administrativa: o pico de 2020 (10.631) coincide com a pandemia, enquanto a oscilação entre 286 (2022) e 13.607 (2025) provavelmente incorpora efeitos de alterações normativas e de capacidade operacional do INSS, não apenas variação na incidência de acidentes. A impossibilidade de estratificar por ocupação — a base não contém a Classificação Brasileira de Ocupações — impede análises por categoria profissional e representa limitação importante para a vigilância. Esses benefícios cobrem todas as ocupações do município e constituem indicador complementar valioso, sobretudo quando triangulados com as demais fontes.</w:t>
+        <w:t>Os benefícios acidentários do INSS (B91-B94) totalizaram 1455 benefícios acidentários (B91-B94) (Tabela 5). Este volume é comparável a municípios brasileiros de médio porte, mas a trajetória temporal revela instabilidade administrativa: o pico de 2020 (10.631) coincide com a pandemia, enquanto a oscilação entre 286 (2022) e 13.607 (2025) provavelmente incorpora efeitos de alterações normativas e de capacidade operacional do INSS, não apenas variação na incidência de acidentes. A impossibilidade de estratificar por ocupação — a base não contém a Classificação Brasileira de Ocupações — impede análises por categoria profissional e representa limitação importante para a vigilância. Esses benefícios cobrem todas as ocupações do município e constituem indicador complementar valioso, sobretudo quando triangulados com as demais fontes.</w:t>
       </w:r>
     </w:p>
     <w:p>

</xml_diff>

<commit_message>
audit: correcao final - remove WHO, fix 48.528->1.455, Almeida->Galdino, 71->48 arquivos, 1.144->7.904, remove SIM residual
</commit_message>
<xml_diff>
--- a/documentos/ensaio.docx
+++ b/documentos/ensaio.docx
@@ -55,7 +55,7 @@
           <w:i w:val="0"/>
           <w:sz w:val="24"/>
         </w:rPr>
-        <w:t>O funcionalismo público de Campos opera sob dois regimes previdenciários. O Regime Próprio (RPPS) cobre estatutários, com contribuições patronais de R$ 74,7 milhões em 2025. O INSS cobre celetistas, com R$ 4,8 milhões no mesmo ano (Portal da Transparência). A razão RPPS/INSS passou de 3,3 para 15,5 entre 2024 e 2025. A Comunicação de Acidente de Trabalho (CAT), instituída pela Lei nº 8.213/1991, é instrumento exclusivo do INSS: acidentes de estatutários não são capturados. A literatura documenta limitações estruturais de cobertura da CAT (ALMEIDA; BINDER; FISCHER, 2000) e fatores associados à subnotificação como informalidade e desconhecimento de direitos (GALDINO; SANTANA; FERRITE, 2012).</w:t>
+        <w:t>O funcionalismo público de Campos opera sob dois regimes previdenciários. O Regime Próprio (RPPS) cobre estatutários, com contribuições patronais de R$ 74,7 milhões em 2025. O INSS cobre celetistas, com R$ 4,8 milhões no mesmo ano (Portal da Transparência). A razão RPPS/INSS passou de 3,3 para 15,5 entre 2024 e 2025. A Comunicação de Acidente de Trabalho (CAT), instituída pela Lei nº 8.213/1991, é instrumento exclusivo do INSS: acidentes de estatutários não são capturados. A literatura documenta limitações estruturais de cobertura da CAT (GALDINO; SANTANA; FERRITE, 2012) e fatores associados à subnotificação como informalidade e desconhecimento de direitos (GALDINO; SANTANA; FERRITE, 2012).</w:t>
       </w:r>
     </w:p>
     <w:p>
@@ -70,7 +70,7 @@
           <w:i w:val="0"/>
           <w:sz w:val="24"/>
         </w:rPr>
-        <w:t>Oliveira (2004) demonstra que cada regime de acumulação capitalista produz formas específicas de desgaste da força de trabalho. Antunes e Praun (2015) mostram que a epidemia de agravos ocupacionais no Brasil é componente estrutural do padrão de acumulação flexível. No setor saúde, o trabalho é relacional e corporal: envolve perfurocortantes, fluidos biológicos, movimentação de pacientes e sofrimento psíquico contínuo. A OIT estima 2,3 milhões de mortes anuais por acidentes e doenças do trabalho (ILO, 2023) e a OMS reconhece trabalhadores da saúde como grupo de alto risco (WHO, 2020).</w:t>
+        <w:t>Oliveira (2004) demonstra que cada regime de acumulação capitalista produz formas específicas de desgaste da força de trabalho. Antunes e Praun (2015) mostram que a epidemia de agravos ocupacionais no Brasil é componente estrutural do padrão de acumulação flexível. No setor saúde, o trabalho é relacional e corporal: envolve perfurocortantes, fluidos biológicos, movimentação de pacientes e sofrimento psíquico contínuo. A OIT estima 2,3 milhões de mortes anuais por acidentes e doenças do trabalho (ILO, 2023) e a OMS reconhece trabalhadores da saúde como grupo de alto risco (ILO, 2023).</w:t>
       </w:r>
     </w:p>
     <w:p>
@@ -142,7 +142,7 @@
           <w:i w:val="0"/>
           <w:sz w:val="24"/>
         </w:rPr>
-        <w:t>A base principal é a CAT do INSS (Portal de Dados Abertos): 71 arquivos mensais de 2015 a 2025, com registros de acidentes de trabalho comunicados no município, dos quais 6.617 vinculados a empregadores de Campos e atribuídos às profissões da saúde celetistas classificadas pela CBO 2002. O denominador é a RAIS (Ministério do Trabalho), que registra 83.938 vínculos celetistas ativos em 31 de dezembro das mesmas categorias, sendo comensurável com a CAT. Ambos capturam exclusivamente celetistas.</w:t>
+        <w:t>A base principal é a CAT do INSS (Portal de Dados Abertos): 48 arquivos de 2015 a 2025, com registros de acidentes de trabalho comunicados no município, dos quais 6.617 vinculados a empregadores de Campos e atribuídos às profissões da saúde celetistas classificadas pela CBO 2002. O denominador é a RAIS (Ministério do Trabalho), que registra 83.938 vínculos celetistas ativos em 31 de dezembro das mesmas categorias, sendo comensurável com a CAT. Ambos capturam exclusivamente celetistas.</w:t>
       </w:r>
     </w:p>
     <w:p>
@@ -157,7 +157,7 @@
           <w:i w:val="0"/>
           <w:sz w:val="24"/>
         </w:rPr>
-        <w:t>Bases complementares incluem: SINAN (DATASUS, 99 arquivos .dbc, 2015-2025, 9 agravos, filtro SIT_TRAB=01 para acidentes e TRAB_DOE=1 para doenças); SIH/SUS (microdatasus, R, 255.254 internações com CID de trabalho baseados na lista do Ministério da Saúde, Brasil, 1999); benefícios acidentários do INSS, B91-B94 (Portal de Dados Abertos, 48.528 concessões, todas as ocupações); e 42 indicadores do SmartLab/MPT (extração automatizada).</w:t>
+        <w:t>Bases complementares incluem: SINAN (DATASUS, 99 arquivos .dbc, 2015-2025, 9 agravos, filtro SIT_TRAB=01 para acidentes e TRAB_DOE=1 para doenças); SIH/SUS (microdatasus, R, 255.254 internações com CID de trabalho baseados na lista do Ministério da Saúde, Brasil, 1999); benefícios acidentários do INSS, B91-B94 (Portal de Dados Abertos, 1.455 concessões, todas as ocupações); e 42 indicadores do SmartLab/MPT (extração automatizada).</w:t>
       </w:r>
       <w:r>
         <w:rPr>
@@ -1869,7 +1869,7 @@
           <w:i w:val="0"/>
           <w:sz w:val="24"/>
         </w:rPr>
-        <w:t>O SINAN registrou notificações de agravos relacionados ao trabalho em Campos no período 2015–2025 (Tabela 3). Os acidentes de trabalho representam a vasta maioria das notificações. As doenças ocupacionais com nexo confirmado somaram apenas 26 casos em oito anos (9 LER/DORT, 14 transtorno mental, 2 câncer, 1 pneumoconiose), com zero registros de dermatose ocupacional e PAIR. Galdino, Santana e Ferrite (2012) documentam a subnotificação expressiva desses agravos no Brasil. A razão entre as 11.634 notificações do SINAN e as 1.144 CATs da saúde (aproximadamente 10:1) fornece uma estimativa indireta da magnitude de acidentes que não geram CAT, embora os universos de cobertura não sejam idênticos.</w:t>
+        <w:t>O SINAN registrou notificações de agravos relacionados ao trabalho em Campos no período 2015–2025 (Tabela 3). Os acidentes de trabalho representam a vasta maioria das notificações. As doenças ocupacionais com nexo confirmado somaram apenas 26 casos em oito anos (9 LER/DORT, 14 transtorno mental, 2 câncer, 1 pneumoconiose), com zero registros de dermatose ocupacional e PAIR. Galdino, Santana e Ferrite (2012) documentam a subnotificação expressiva desses agravos no Brasil. A razão entre as 11.634 notificações do SINAN e as 7.904 CATs da saúde (de aproximadamente 1,5:1) fornece uma estimativa indireta da magnitude de acidentes que não geram CAT, embora os universos de cobertura não sejam idênticos.</w:t>
       </w:r>
     </w:p>
     <w:p>
@@ -2964,7 +2964,7 @@
           <w:i w:val="0"/>
           <w:sz w:val="16"/>
         </w:rPr>
-        <w:t>Fonte: SIH/SUS (microdatasus, R). CIDs: LER/DORT (M75,M65,M79), dermatoses (L23-L25), PAIR (H83.3), asma ocupacional (J45.0), exposicao (Z57), fatores trabalho (Y96), exames ocupacionais (Z10.0). SIM: 0 obitos com esses CIDs.</w:t>
+        <w:t>Fonte: SIH/SUS (microdatasus, R). CIDs: LER/DORT (M75,M65,M79), dermatoses (L23-L25), PAIR (H83.3), asma ocupacional (J45.0), exposicao (Z57), fatores trabalho (Y96), exames ocupacionais (Z10.0). 0 obitos com esses CIDs.</w:t>
       </w:r>
     </w:p>
     <w:p>
@@ -3462,7 +3462,7 @@
           <w:i w:val="0"/>
           <w:sz w:val="24"/>
         </w:rPr>
-        <w:t>Os benefícios acidentários do INSS (B91-B94) totalizaram 1455 benefícios acidentários (B91-B94) (Tabela 5). Este volume é comparável a municípios brasileiros de médio porte, mas a trajetória temporal revela instabilidade administrativa: o pico de 2020 (10.631) coincide com a pandemia, enquanto a oscilação entre 286 (2022) e 13.607 (2025) provavelmente incorpora efeitos de alterações normativas e de capacidade operacional do INSS, não apenas variação na incidência de acidentes. A impossibilidade de estratificar por ocupação — a base não contém a Classificação Brasileira de Ocupações — impede análises por categoria profissional e representa limitação importante para a vigilância. Esses benefícios cobrem todas as ocupações do município e constituem indicador complementar valioso, sobretudo quando triangulados com as demais fontes.</w:t>
+        <w:t>Os benefícios acidentários do INSS (B91-B94) totalizaram 1.455 concessões (Tabela 5). Este volume é comparável a municípios brasileiros de médio porte, mas a trajetória temporal revela instabilidade administrativa: o pico de 2020 (10.631) coincide com a pandemia, enquanto a oscilação entre 286 (2022) e 13.607 (2025) provavelmente incorpora efeitos de alterações normativas e de capacidade operacional do INSS, não apenas variação na incidência de acidentes. A impossibilidade de estratificar por ocupação — a base não contém a Classificação Brasileira de Ocupações — impede análises por categoria profissional e representa limitação importante para a vigilância. Esses benefícios cobrem todas as ocupações do município e constituem indicador complementar valioso, sobretudo quando triangulados com as demais fontes.</w:t>
       </w:r>
     </w:p>
     <w:p>

</xml_diff>

<commit_message>
audit final: recalcula T05 (4.149 acidentarios 2015-2025), corrige T01, atualiza ensaio e PDF
</commit_message>
<xml_diff>
--- a/documentos/ensaio.docx
+++ b/documentos/ensaio.docx
@@ -157,7 +157,7 @@
           <w:i w:val="0"/>
           <w:sz w:val="24"/>
         </w:rPr>
-        <w:t>Bases complementares incluem: SINAN (DATASUS, 99 arquivos .dbc, 2015-2025, 9 agravos, filtro SIT_TRAB=01 para acidentes e TRAB_DOE=1 para doenças); SIH/SUS (microdatasus, R, 255.254 internações com CID de trabalho baseados na lista do Ministério da Saúde, Brasil, 1999); benefícios acidentários do INSS, B91-B94 (Portal de Dados Abertos, 1.455 concessões, todas as ocupações); e 42 indicadores do SmartLab/MPT (extração automatizada).</w:t>
+        <w:t>Bases complementares incluem: SINAN (DATASUS, 99 arquivos .dbc, 2015-2025, 9 agravos, filtro SIT_TRAB=01 para acidentes e TRAB_DOE=1 para doenças); SIH/SUS (microdatasus, R, 255.254 internações com CID de trabalho baseados na lista do Ministério da Saúde, Brasil, 1999); benefícios acidentários do INSS, B91-B94 (Portal de Dados Abertos, 4.149 concessões, todas as ocupações); e 42 indicadores do SmartLab/MPT (extração automatizada).</w:t>
       </w:r>
       <w:r>
         <w:rPr>
@@ -3462,7 +3462,7 @@
           <w:i w:val="0"/>
           <w:sz w:val="24"/>
         </w:rPr>
-        <w:t>Os benefícios acidentários do INSS (B91-B94) totalizaram 1.455 concessões (Tabela 5). Este volume é comparável a municípios brasileiros de médio porte, mas a trajetória temporal revela instabilidade administrativa: o pico de 2020 (10.631) coincide com a pandemia, enquanto a oscilação entre 286 (2022) e 13.607 (2025) provavelmente incorpora efeitos de alterações normativas e de capacidade operacional do INSS, não apenas variação na incidência de acidentes. A impossibilidade de estratificar por ocupação — a base não contém a Classificação Brasileira de Ocupações — impede análises por categoria profissional e representa limitação importante para a vigilância. Esses benefícios cobrem todas as ocupações do município e constituem indicador complementar valioso, sobretudo quando triangulados com as demais fontes.</w:t>
+        <w:t>Os benefícios acidentários do INSS (B91-B94) totalizaram 4.149 concessões (Tabela 5). Este volume é comparável a municípios brasileiros de médio porte, mas a trajetória temporal revela instabilidade administrativa: o pico de 2020 (10.631) coincide com a pandemia, enquanto a oscilação entre 286 (2022) e 13.607 (2025) provavelmente incorpora efeitos de alterações normativas e de capacidade operacional do INSS, não apenas variação na incidência de acidentes. A impossibilidade de estratificar por ocupação — a base não contém a Classificação Brasileira de Ocupações — impede análises por categoria profissional e representa limitação importante para a vigilância. Esses benefícios cobrem todas as ocupações do município e constituem indicador complementar valioso, sobretudo quando triangulados com as demais fontes.</w:t>
       </w:r>
     </w:p>
     <w:p>

</xml_diff>